<commit_message>
Marketing docs and license agreement updates
</commit_message>
<xml_diff>
--- a/docs/GeoNap_License_Distribution_Agreement/GeoNap_License_Distribution_Agreement_20260707.docx
+++ b/docs/GeoNap_License_Distribution_Agreement/GeoNap_License_Distribution_Agreement_20260707.docx
@@ -300,7 +300,13 @@
         <w:spacing w:after="160"/>
       </w:pPr>
       <w:r>
-        <w:t>In consideration of the license granted herein, Licensee shall pay Developer for the following costs incurred in connection with publishing and operating the App on the Apple App Store:</w:t>
+        <w:t xml:space="preserve">In consideration of the license granted herein, Licensee shall pay Developer </w:t>
+      </w:r>
+      <w:r>
+        <w:t xml:space="preserve">$330 annually </w:t>
+      </w:r>
+      <w:r>
+        <w:t>for the following costs incurred in connection with publishing and operating the App on the Apple App Store:</w:t>
       </w:r>
     </w:p>
     <w:p>
@@ -318,15 +324,402 @@
         <w:spacing w:after="120"/>
       </w:pPr>
       <w:r>
-        <w:t>Other reasonable, documented costs directly attributable to the App’s operation and to Licensee’s End Users’ use of the App, which may include additional hosting, storage, third-party API, notification, or infrastructure costs incurred as a direct result of Licensee’s Free Client Allocation usage (collectively with the above, the “App Costs”).</w:t>
+        <w:t xml:space="preserve">Other reasonable, documented costs </w:t>
+      </w:r>
+      <w:r>
+        <w:t>(</w:t>
+      </w:r>
+      <w:r>
+        <w:t>$</w:t>
+      </w:r>
+      <w:r>
+        <w:t>240</w:t>
+      </w:r>
+      <w:r>
+        <w:t xml:space="preserve"> USD per year</w:t>
+      </w:r>
+      <w:r>
+        <w:t xml:space="preserve">) </w:t>
+      </w:r>
+      <w:r>
+        <w:t>directly attributable to the App’s operation and to Licensee’s End Users’ use of the App, which may include additional hosting, storage, third-party API, notification, or infrastructure costs incurred as a direct result of Licensee’s Free Client Allocation usage (collectively with the above, the “App Costs”).</w:t>
       </w:r>
     </w:p>
+    <w:tbl>
+      <w:tblPr>
+        <w:tblStyle w:val="TableGrid"/>
+        <w:tblW w:w="0" w:type="auto"/>
+        <w:tblInd w:w="360" w:type="dxa"/>
+        <w:tblLook w:val="04A0" w:firstRow="1" w:lastRow="0" w:firstColumn="1" w:lastColumn="0" w:noHBand="0" w:noVBand="1"/>
+      </w:tblPr>
+      <w:tblGrid>
+        <w:gridCol w:w="4494"/>
+        <w:gridCol w:w="901"/>
+        <w:gridCol w:w="901"/>
+        <w:gridCol w:w="1072"/>
+      </w:tblGrid>
+      <w:tr>
+        <w:tc>
+          <w:tcPr>
+            <w:tcW w:w="4494" w:type="dxa"/>
+            <w:shd w:val="pct15" w:color="auto" w:fill="auto"/>
+          </w:tcPr>
+          <w:p>
+            <w:pPr>
+              <w:pStyle w:val="ListBullet"/>
+              <w:numPr>
+                <w:ilvl w:val="0"/>
+                <w:numId w:val="0"/>
+              </w:numPr>
+              <w:spacing w:after="120"/>
+              <w:jc w:val="center"/>
+              <w:rPr>
+                <w:b/>
+                <w:bCs/>
+              </w:rPr>
+            </w:pPr>
+            <w:r>
+              <w:rPr>
+                <w:b/>
+                <w:bCs/>
+              </w:rPr>
+              <w:t>Item</w:t>
+            </w:r>
+          </w:p>
+        </w:tc>
+        <w:tc>
+          <w:tcPr>
+            <w:tcW w:w="901" w:type="dxa"/>
+            <w:shd w:val="pct15" w:color="auto" w:fill="auto"/>
+          </w:tcPr>
+          <w:p>
+            <w:pPr>
+              <w:pStyle w:val="ListBullet"/>
+              <w:numPr>
+                <w:ilvl w:val="0"/>
+                <w:numId w:val="0"/>
+              </w:numPr>
+              <w:spacing w:after="120"/>
+              <w:rPr>
+                <w:b/>
+                <w:bCs/>
+              </w:rPr>
+            </w:pPr>
+            <w:r>
+              <w:rPr>
+                <w:b/>
+                <w:bCs/>
+              </w:rPr>
+              <w:t>Unit Cost</w:t>
+            </w:r>
+          </w:p>
+        </w:tc>
+        <w:tc>
+          <w:tcPr>
+            <w:tcW w:w="901" w:type="dxa"/>
+            <w:shd w:val="pct15" w:color="auto" w:fill="auto"/>
+          </w:tcPr>
+          <w:p>
+            <w:pPr>
+              <w:pStyle w:val="ListBullet"/>
+              <w:numPr>
+                <w:ilvl w:val="0"/>
+                <w:numId w:val="0"/>
+              </w:numPr>
+              <w:spacing w:after="120"/>
+              <w:rPr>
+                <w:b/>
+                <w:bCs/>
+              </w:rPr>
+            </w:pPr>
+            <w:r>
+              <w:rPr>
+                <w:b/>
+                <w:bCs/>
+              </w:rPr>
+              <w:t>Units</w:t>
+            </w:r>
+          </w:p>
+        </w:tc>
+        <w:tc>
+          <w:tcPr>
+            <w:tcW w:w="1024" w:type="dxa"/>
+            <w:shd w:val="pct15" w:color="auto" w:fill="auto"/>
+          </w:tcPr>
+          <w:p>
+            <w:pPr>
+              <w:pStyle w:val="ListBullet"/>
+              <w:numPr>
+                <w:ilvl w:val="0"/>
+                <w:numId w:val="0"/>
+              </w:numPr>
+              <w:spacing w:after="120"/>
+              <w:rPr>
+                <w:b/>
+                <w:bCs/>
+              </w:rPr>
+            </w:pPr>
+            <w:r>
+              <w:rPr>
+                <w:b/>
+                <w:bCs/>
+              </w:rPr>
+              <w:t>Total</w:t>
+            </w:r>
+          </w:p>
+          <w:p>
+            <w:pPr>
+              <w:pStyle w:val="ListBullet"/>
+              <w:numPr>
+                <w:ilvl w:val="0"/>
+                <w:numId w:val="0"/>
+              </w:numPr>
+              <w:spacing w:after="120"/>
+              <w:rPr>
+                <w:b/>
+                <w:bCs/>
+              </w:rPr>
+            </w:pPr>
+            <w:r>
+              <w:rPr>
+                <w:b/>
+                <w:bCs/>
+              </w:rPr>
+              <w:t>(annual)</w:t>
+            </w:r>
+          </w:p>
+        </w:tc>
+      </w:tr>
+      <w:tr>
+        <w:tc>
+          <w:tcPr>
+            <w:tcW w:w="4494" w:type="dxa"/>
+          </w:tcPr>
+          <w:p>
+            <w:pPr>
+              <w:pStyle w:val="ListBullet"/>
+              <w:numPr>
+                <w:ilvl w:val="0"/>
+                <w:numId w:val="0"/>
+              </w:numPr>
+              <w:spacing w:after="120"/>
+              <w:jc w:val="center"/>
+            </w:pPr>
+            <w:r>
+              <w:t>Apple Developer Program enrollment fee</w:t>
+            </w:r>
+          </w:p>
+        </w:tc>
+        <w:tc>
+          <w:tcPr>
+            <w:tcW w:w="901" w:type="dxa"/>
+          </w:tcPr>
+          <w:p>
+            <w:pPr>
+              <w:pStyle w:val="ListBullet"/>
+              <w:numPr>
+                <w:ilvl w:val="0"/>
+                <w:numId w:val="0"/>
+              </w:numPr>
+              <w:spacing w:after="120"/>
+              <w:jc w:val="right"/>
+            </w:pPr>
+            <w:r>
+              <w:t>$90</w:t>
+            </w:r>
+          </w:p>
+        </w:tc>
+        <w:tc>
+          <w:tcPr>
+            <w:tcW w:w="901" w:type="dxa"/>
+          </w:tcPr>
+          <w:p>
+            <w:pPr>
+              <w:pStyle w:val="ListBullet"/>
+              <w:numPr>
+                <w:ilvl w:val="0"/>
+                <w:numId w:val="0"/>
+              </w:numPr>
+              <w:spacing w:after="120"/>
+              <w:jc w:val="right"/>
+            </w:pPr>
+            <w:r>
+              <w:t>1</w:t>
+            </w:r>
+          </w:p>
+        </w:tc>
+        <w:tc>
+          <w:tcPr>
+            <w:tcW w:w="1024" w:type="dxa"/>
+          </w:tcPr>
+          <w:p>
+            <w:pPr>
+              <w:pStyle w:val="ListBullet"/>
+              <w:numPr>
+                <w:ilvl w:val="0"/>
+                <w:numId w:val="0"/>
+              </w:numPr>
+              <w:spacing w:after="120"/>
+              <w:jc w:val="right"/>
+            </w:pPr>
+            <w:r>
+              <w:t>$90</w:t>
+            </w:r>
+          </w:p>
+        </w:tc>
+      </w:tr>
+      <w:tr>
+        <w:tc>
+          <w:tcPr>
+            <w:tcW w:w="4494" w:type="dxa"/>
+          </w:tcPr>
+          <w:p>
+            <w:pPr>
+              <w:pStyle w:val="ListBullet"/>
+              <w:numPr>
+                <w:ilvl w:val="0"/>
+                <w:numId w:val="0"/>
+              </w:numPr>
+              <w:spacing w:after="120"/>
+              <w:jc w:val="center"/>
+            </w:pPr>
+            <w:r>
+              <w:t>Other reasonable, documented costs</w:t>
+            </w:r>
+          </w:p>
+        </w:tc>
+        <w:tc>
+          <w:tcPr>
+            <w:tcW w:w="901" w:type="dxa"/>
+          </w:tcPr>
+          <w:p>
+            <w:pPr>
+              <w:pStyle w:val="ListBullet"/>
+              <w:numPr>
+                <w:ilvl w:val="0"/>
+                <w:numId w:val="0"/>
+              </w:numPr>
+              <w:spacing w:after="120"/>
+              <w:jc w:val="right"/>
+            </w:pPr>
+            <w:r>
+              <w:t>$20</w:t>
+            </w:r>
+          </w:p>
+        </w:tc>
+        <w:tc>
+          <w:tcPr>
+            <w:tcW w:w="901" w:type="dxa"/>
+          </w:tcPr>
+          <w:p>
+            <w:pPr>
+              <w:pStyle w:val="ListBullet"/>
+              <w:numPr>
+                <w:ilvl w:val="0"/>
+                <w:numId w:val="0"/>
+              </w:numPr>
+              <w:spacing w:after="120"/>
+              <w:jc w:val="right"/>
+            </w:pPr>
+            <w:r>
+              <w:t>12</w:t>
+            </w:r>
+          </w:p>
+        </w:tc>
+        <w:tc>
+          <w:tcPr>
+            <w:tcW w:w="1024" w:type="dxa"/>
+          </w:tcPr>
+          <w:p>
+            <w:pPr>
+              <w:pStyle w:val="ListBullet"/>
+              <w:numPr>
+                <w:ilvl w:val="0"/>
+                <w:numId w:val="0"/>
+              </w:numPr>
+              <w:spacing w:after="120"/>
+              <w:jc w:val="right"/>
+            </w:pPr>
+            <w:r>
+              <w:t>$240</w:t>
+            </w:r>
+          </w:p>
+        </w:tc>
+      </w:tr>
+      <w:tr>
+        <w:tc>
+          <w:tcPr>
+            <w:tcW w:w="6296" w:type="dxa"/>
+            <w:gridSpan w:val="3"/>
+          </w:tcPr>
+          <w:p>
+            <w:pPr>
+              <w:pStyle w:val="ListBullet"/>
+              <w:numPr>
+                <w:ilvl w:val="0"/>
+                <w:numId w:val="0"/>
+              </w:numPr>
+              <w:spacing w:after="120"/>
+              <w:jc w:val="right"/>
+              <w:rPr>
+                <w:b/>
+                <w:bCs/>
+              </w:rPr>
+            </w:pPr>
+            <w:r>
+              <w:rPr>
+                <w:b/>
+                <w:bCs/>
+              </w:rPr>
+              <w:t>Total Cost (annual)</w:t>
+            </w:r>
+          </w:p>
+        </w:tc>
+        <w:tc>
+          <w:tcPr>
+            <w:tcW w:w="1024" w:type="dxa"/>
+          </w:tcPr>
+          <w:p>
+            <w:pPr>
+              <w:pStyle w:val="ListBullet"/>
+              <w:numPr>
+                <w:ilvl w:val="0"/>
+                <w:numId w:val="0"/>
+              </w:numPr>
+              <w:spacing w:after="120"/>
+              <w:jc w:val="right"/>
+              <w:rPr>
+                <w:b/>
+                <w:bCs/>
+              </w:rPr>
+            </w:pPr>
+            <w:r>
+              <w:rPr>
+                <w:b/>
+                <w:bCs/>
+              </w:rPr>
+              <w:t>$330</w:t>
+            </w:r>
+          </w:p>
+        </w:tc>
+      </w:tr>
+    </w:tbl>
     <w:p>
       <w:pPr>
+        <w:pStyle w:val="ListBullet"/>
+        <w:numPr>
+          <w:ilvl w:val="0"/>
+          <w:numId w:val="0"/>
+        </w:numPr>
+        <w:spacing w:after="120"/>
+      </w:pPr>
+    </w:p>
+    <w:p>
+      <w:pPr>
         <w:spacing w:after="160"/>
       </w:pPr>
       <w:r>
-        <w:t>Developer shall invoice Licensee for App Costs at reasonable intervals (at least annually for the Apple Developer Program fee), with reasonable supporting documentation. Licensee shall pay each invoice within thirty (30) days of receipt. Late payments may result in suspension of the license granted herein until payment is made current.</w:t>
+        <w:t>Developer shall invoice Licensee for App Costs at reasonable intervals (at least annually), with reasonable supporting documentation. Licensee shall pay each invoice within thirty (30) days of receipt. Late payments may result in suspension of the license granted herein until payment is made current.</w:t>
       </w:r>
     </w:p>
     <w:p>
@@ -369,10 +762,7 @@
         <w:t xml:space="preserve">, automatically renewing for successive </w:t>
       </w:r>
       <w:r>
-        <w:t>six (6) month</w:t>
-      </w:r>
-      <w:r>
-        <w:t xml:space="preserve"> </w:t>
+        <w:t xml:space="preserve">six (6) month </w:t>
       </w:r>
       <w:r>
         <w:t>terms unless either Party provides the other with written notice of non-renewal at least thirty (30) days prior to the end of the then-current term.</w:t>
@@ -391,7 +781,11 @@
         <w:spacing w:after="160"/>
       </w:pPr>
       <w:r>
-        <w:t>Upon termination or expiration, the license granted in Section 2 shall immediately terminate, Licensee shall cease all distribution of and access to the App to End Users, and any unpaid App Costs incurred prior to termination shall remain due and payable. Sections 4, 5, 8, 9, 10, 11, and 13 shall survive termination.</w:t>
+        <w:t xml:space="preserve">Upon termination or expiration, the license granted in Section 2 shall immediately terminate, Licensee shall cease all distribution of and access to the App to End Users, and any unpaid App </w:t>
+      </w:r>
+      <w:r>
+        <w:lastRenderedPageBreak/>
+        <w:t>Costs incurred prior to termination shall remain due and payable. Sections 4, 5, 8, 9, 10, 11, and 13 shall survive termination.</w:t>
       </w:r>
     </w:p>
     <w:p>
@@ -411,11 +805,7 @@
         <w:spacing w:after="160"/>
       </w:pPr>
       <w:r>
-        <w:t xml:space="preserve">THE APP IS PROVIDED “AS IS” AND “AS AVAILABLE,” WITHOUT WARRANTY OF ANY KIND, WHETHER EXPRESS, IMPLIED, OR STATUTORY, INCLUDING WITHOUT LIMITATION ANY IMPLIED WARRANTIES OF MERCHANTABILITY, FITNESS FOR A PARTICULAR PURPOSE, NON-INFRINGEMENT, OR THAT THE APP WILL BE UNINTERRUPTED, ERROR-FREE, OR SECURE. DEVELOPER MAKES NO </w:t>
-      </w:r>
-      <w:r>
-        <w:lastRenderedPageBreak/>
-        <w:t>REPRESENTATION OR WARRANTY REGARDING THE ACCURACY, RELIABILITY, OR AVAILABILITY OF THE APP.</w:t>
+        <w:t>THE APP IS PROVIDED “AS IS” AND “AS AVAILABLE,” WITHOUT WARRANTY OF ANY KIND, WHETHER EXPRESS, IMPLIED, OR STATUTORY, INCLUDING WITHOUT LIMITATION ANY IMPLIED WARRANTIES OF MERCHANTABILITY, FITNESS FOR A PARTICULAR PURPOSE, NON-INFRINGEMENT, OR THAT THE APP WILL BE UNINTERRUPTED, ERROR-FREE, OR SECURE. DEVELOPER MAKES NO REPRESENTATION OR WARRANTY REGARDING THE ACCURACY, RELIABILITY, OR AVAILABILITY OF THE APP.</w:t>
       </w:r>
     </w:p>
     <w:p>
@@ -499,6 +889,7 @@
         <w:spacing w:after="160"/>
       </w:pPr>
       <w:r>
+        <w:lastRenderedPageBreak/>
         <w:t>Licensee acknowledges that use and distribution of the App remains subject to Apple Inc.’s App Store Review Guidelines, Developer Program License Agreement, and End User License Agreement, and that Developer’s ability to provide the App may be affected by changes to Apple’s policies outside Developer’s control. Licensee shall ensure that its End Users comply with all applicable Apple terms of use.</w:t>
       </w:r>
     </w:p>
@@ -519,7 +910,6 @@
         <w:spacing w:after="160"/>
       </w:pPr>
       <w:r>
-        <w:lastRenderedPageBreak/>
         <w:t>Each Party agrees to keep confidential any non-public business, technical, or financial information disclosed by the other Party in connection with this Agreement, and to use such information solely to perform its obligations hereunder, except as required by law.</w:t>
       </w:r>
     </w:p>
@@ -920,7 +1310,7 @@
       <w:jc w:val="right"/>
     </w:pPr>
     <w:r>
-      <w:t>09072026</w:t>
+      <w:t>20260710</w:t>
     </w:r>
   </w:p>
 </w:hdr>

</xml_diff>